<commit_message>
ui updates and resume changes
</commit_message>
<xml_diff>
--- a/Katie Boehlke Resume 2026.docx
+++ b/Katie Boehlke Resume 2026.docx
@@ -678,7 +678,7 @@
             <w:u w:val="single"/>
             <w:rtl w:val="0"/>
           </w:rPr>
-          <w:t xml:space="preserve">Wedding Website &amp; Guest Management App</w:t>
+          <w:t xml:space="preserve">Recipe Book — AI-Powered Recipe &amp; Meal Planning App</w:t>
         </w:r>
       </w:hyperlink>
       <w:r>
@@ -725,13 +725,29 @@
         <w:rPr>
           <w:rtl w:val="0"/>
         </w:rPr>
-        <w:t xml:space="preserve">Built a fully responsive wedding website in React with an RSVP system and integrated MongoDB for guest management.</w:t>
-      </w:r>
-      <w:r>
-        <w:rPr>
-          <w:rtl w:val="0"/>
-        </w:rPr>
-        <w:t xml:space="preserve"> </w:t>
+        <w:t xml:space="preserve">Built a full-stack recipe and meal-planning app (Django REST API, React PWA frontend) with JWT auth, family recipe sharing, and shopping lists auto-organized by grocery category.</w:t>
+      </w:r>
+    </w:p>
+    <w:p>
+      <w:pPr>
+        <w:numPr>
+          <w:ilvl w:val="0"/>
+          <w:numId w:val="3"/>
+        </w:numPr>
+        <w:rPr>
+          <w:rFonts w:ascii="Roboto Light" w:cs="Roboto Light" w:eastAsia="Roboto Light" w:hAnsi="Roboto Light"/>
+          <w:b w:val="0"/>
+          <w:bCs w:val="0"/>
+          <w:color w:val="666666"/>
+          <w:sz w:val="18"/>
+          <w:szCs w:val="18"/>
+        </w:rPr>
+      </w:pPr>
+      <w:r>
+        <w:rPr>
+          <w:rtl w:val="0"/>
+        </w:rPr>
+        <w:t xml:space="preserve">Integrated the Claude API to auto-extract structured recipes (ingredients, steps, tags) from any pasted URL or video link, plus AI-assisted tag suggestions and unit conversion.</w:t>
       </w:r>
     </w:p>
     <w:p>

</xml_diff>